<commit_message>
feat: Presupuesto Integral Multioficio + cambios locales pendientes
- Nueva tarjeta en portada (Presupuestos de Obra): sube un informe/presupuesto
  (PDF, Word, Excel, imagen o texto) y extrae TODAS las partidas de cualquier oficio.
- Extraccion robusta con continuacion automatica si la respuesta se corta.
- Tabla editable (anadir/borrar/modificar) antes de generar; salida obra 1 opcion.
- Banner superior PRESUPUESTO INTEGRAL MULTIOFICIO en el DOCX.
- Sube max_tokens 4096 a 16000 en flujos IA (generar partidas / subcontrata).
- Incluye otros cambios locales previos ya pendientes en el repo.

Co-Authored-By: Claude Opus 4.8 (1M context) <noreply@anthropic.com>
</commit_message>
<xml_diff>
--- a/templates/MODELO_CONTRATO_SUBCONTRATA.docx
+++ b/templates/MODELO_CONTRATO_SUBCONTRATA.docx
@@ -1045,7 +1045,7 @@
           <w:color w:val="000000"/>
           <w:lang w:val="pt-PT"/>
         </w:rPr>
-        <w:t xml:space="preserve">DE UNA PARTE, Dña. [[SUBC_REP_NOMBRE]], mayor de edad, con domicilio estos efectos en Madrid, calle [[SUBC_REP_DOMICILIO]], con Documento Nacional de identidadnúmero [[SUBC_REP_DNI]], actuando ensu condición de Administrador único de la entidad mercantil denominada “[[SUBC_EMPRESA]].”, con domicilio social en [[SUBC_DOMICILIO]] y con C.I.F. número [[SUBC_CIF]], Constituida por tiempo indefinido, mediante escritura otorgada por el Notario [[SUBC_NOTARIO]] de la localidad de Arganda del Rey, en fecha 08/07/2013, número 908 de su protocolo, e inscrita en el Registro Mercantil de Madrid, [[SUBC_REGISTRO]].</w:t>
+        <w:t>DE UNA PARTE, Dña. [[SUBC_REP_NOMBRE]], mayor de edad, con domicilio estos efectos en Madrid, calle [[SUBC_REP_DOMICILIO]], con Documento Nacional de identidadnúmero [[SUBC_REP_DNI]], actuando ensu condición de Administrador único de la entidad mercantil denominada “[[SUBC_EMPRESA]].”, con domicilio social en [[SUBC_DOMICILIO]] y con C.I.F. número [[SUBC_CIF]], Constituida por tiempo indefinido, mediante escritura otorgada por el Notario [[SUBC_NOTARIO]] de la localidad de [[SUBC_NOTARIO_LOC]], en fecha [[SUBC_FECHA_ESCRITURA]], número [[SUBC_PROTOCOLO]] de su protocolo, e inscrita en el Registro Mercantil de Madrid, [[SUBC_REGISTRO]].</w:t>
       </w:r>
     </w:p>
     <w:bookmarkEnd w:id="2"/>
@@ -1076,7 +1076,7 @@
           <w:rFonts w:ascii="Century Gothic" w:hAnsi="Century Gothic" w:cs="Arial"/>
           <w:color w:val="000000"/>
         </w:rPr>
-        <w:t>Cargo de Administrador único que ostenta en virtud de escritura de [[SUBC_FECHA_ESCRITURA]], otorgada el [[SUBC_FECHA_ESCRITURA]] ante el Notario de Madrid, [[SUBC_NOTARIO]] bajo el [[SUBC_PROTOCOLO]] de los de su protocolo.</w:t>
+        <w:t>Cargo de Administrador único que ostenta en virtud de escritura de [[SUBC_FECHA_ESCRITURA]], otorgada el [[SUBC_FECHA_ESCRITURA]] ante el Notario de [[SUBC_NOTARIO_LOC]], [[SUBC_NOTARIO]] bajo el [[SUBC_PROTOCOLO]] de los de su protocolo.</w:t>
       </w:r>
     </w:p>
     <w:bookmarkEnd w:id="3"/>
@@ -3849,6 +3849,123 @@
           <w:b/>
         </w:rPr>
       </w:pPr>
+    </w:p>
+    <w:p>
+      <w:r>
+        <w:rPr>
+          <w:rFonts w:ascii="Century Gothic" w:hAnsi="Century Gothic"/>
+          <w:b w:val="0"/>
+          <w:sz w:val="22"/>
+        </w:rPr>
+      </w:r>
+    </w:p>
+    <w:p>
+      <w:r>
+        <w:rPr>
+          <w:rFonts w:ascii="Century Gothic" w:hAnsi="Century Gothic"/>
+          <w:b/>
+          <w:sz w:val="22"/>
+        </w:rPr>
+        <w:t>Por EL CONTRATISTA:</w:t>
+      </w:r>
+    </w:p>
+    <w:p>
+      <w:r>
+        <w:rPr>
+          <w:rFonts w:ascii="Century Gothic" w:hAnsi="Century Gothic"/>
+          <w:b w:val="0"/>
+          <w:sz w:val="22"/>
+        </w:rPr>
+        <w:t>ACOMETIDAS EUROPA, S.L.</w:t>
+      </w:r>
+    </w:p>
+    <w:p>
+      <w:r>
+        <w:rPr>
+          <w:rFonts w:ascii="Century Gothic" w:hAnsi="Century Gothic"/>
+          <w:b w:val="0"/>
+          <w:sz w:val="22"/>
+        </w:rPr>
+        <w:t>Domicilio: Avda. Doctor Severo Ochoa 35, Nave 5dD - Alcobendas</w:t>
+      </w:r>
+    </w:p>
+    <w:p>
+      <w:r>
+        <w:rPr>
+          <w:rFonts w:ascii="Century Gothic" w:hAnsi="Century Gothic"/>
+          <w:b w:val="0"/>
+          <w:sz w:val="22"/>
+        </w:rPr>
+        <w:t>Telefono: 91 386 21 12     Email: info@acometidaseuropa.com</w:t>
+      </w:r>
+    </w:p>
+    <w:p>
+      <w:r>
+        <w:rPr>
+          <w:rFonts w:ascii="Century Gothic" w:hAnsi="Century Gothic"/>
+          <w:b w:val="0"/>
+          <w:sz w:val="22"/>
+        </w:rPr>
+      </w:r>
+    </w:p>
+    <w:p>
+      <w:r>
+        <w:rPr>
+          <w:rFonts w:ascii="Century Gothic" w:hAnsi="Century Gothic"/>
+          <w:b/>
+          <w:sz w:val="22"/>
+        </w:rPr>
+        <w:t>Por LA SUBCONTRATISTA:</w:t>
+      </w:r>
+    </w:p>
+    <w:p>
+      <w:r>
+        <w:rPr>
+          <w:rFonts w:ascii="Century Gothic" w:hAnsi="Century Gothic"/>
+          <w:b w:val="0"/>
+          <w:sz w:val="22"/>
+        </w:rPr>
+        <w:t>[[SUBC_EMPRESA]]     CIF: [[SUBC_CIF]]</w:t>
+      </w:r>
+    </w:p>
+    <w:p>
+      <w:r>
+        <w:rPr>
+          <w:rFonts w:ascii="Century Gothic" w:hAnsi="Century Gothic"/>
+          <w:b w:val="0"/>
+          <w:sz w:val="22"/>
+        </w:rPr>
+        <w:t>Domicilio: [[SUBC_DOMICILIO]]</w:t>
+      </w:r>
+    </w:p>
+    <w:p>
+      <w:r>
+        <w:rPr>
+          <w:rFonts w:ascii="Century Gothic" w:hAnsi="Century Gothic"/>
+          <w:b w:val="0"/>
+          <w:sz w:val="22"/>
+        </w:rPr>
+        <w:t>Representante: [[SUBC_REP_NOMBRE]]     DNI: [[SUBC_REP_DNI]]</w:t>
+      </w:r>
+    </w:p>
+    <w:p>
+      <w:r>
+        <w:rPr>
+          <w:rFonts w:ascii="Century Gothic" w:hAnsi="Century Gothic"/>
+          <w:b w:val="0"/>
+          <w:sz w:val="22"/>
+        </w:rPr>
+        <w:t>Telefono: [[SUBC_TELEFONO]]     Email: [[SUBC_EMAIL]]</w:t>
+      </w:r>
+    </w:p>
+    <w:p>
+      <w:r>
+        <w:rPr>
+          <w:rFonts w:ascii="Century Gothic" w:hAnsi="Century Gothic"/>
+          <w:b w:val="0"/>
+          <w:sz w:val="22"/>
+        </w:rPr>
+      </w:r>
     </w:p>
     <w:p>
       <w:pPr>

</xml_diff>